<commit_message>
Link Academia profile across publication assets
</commit_message>
<xml_diff>
--- a/academia/output/Emmanuel_Onuoha_Telecom_Churn_Technical_Report.docx
+++ b/academia/output/Emmanuel_Onuoha_Telecom_Churn_Technical_Report.docx
@@ -112,6 +112,14 @@
       </w:pPr>
       <w:r>
         <w:t>Kaggle profile: https://www.kaggle.com/onuohaemmanuel</w:t>
+      </w:r>
+    </w:p>
+    <w:p>
+      <w:pPr>
+        <w:pStyle w:val="ListBullet"/>
+      </w:pPr>
+      <w:r>
+        <w:t>Academia profile: https://independent.academia.edu/emmanuelonuoha24</w:t>
       </w:r>
     </w:p>
     <w:p>

</xml_diff>